<commit_message>
Gap analysis v8 refined: downgrade 4h, split 5i, add detection limits
Section 12 refinements based on testing and analysis:

1. Item 4h downgraded from standalone "Exploit Window metric" to
   narrative enhancement — testing showed MTTR vs AI speed comparison
   is not measurable or actionable (every org fails, no benchmark exists)

2. Item 5i split into two tiers:
   - Tier 1: Externally observable (automated) — EDR detection, patch
     cadence, Glasswing lookup, bug bounty, security.txt, CDN/WAF
   - Tier 2: Self-reported (questionnaire) — underwriting questions at
     scan start for AI tools, autonomous patching, endpoint protection

3. New subsection 12.5: What CAN vs CANNOT be detected externally
   - CAN: EDR vendor, patch cadence, CDN, bug bounty, VDP, Glasswing
   - CANNOT: autonomous patching, internal scanning, MFA, IR readiness

4. Priority table updated to reflect all changes

Co-Authored-By: Claude Opus 4.6 (1M context) <noreply@anthropic.com>
</commit_message>
<xml_diff>
--- a/security_scanner/Phishield_Scanner_Gap_Analysis_v8.docx
+++ b/security_scanner/Phishield_Scanner_Gap_Analysis_v8.docx
@@ -44,23 +44,13 @@
         <w:spacing w:after="120"/>
         <w:jc w:val="center"/>
       </w:pPr>
-      <w:proofErr w:type="spellStart"/>
       <w:r>
         <w:rPr>
           <w:color w:val="2E5090"/>
           <w:sz w:val="28"/>
           <w:szCs w:val="28"/>
         </w:rPr>
-        <w:t>Phishield</w:t>
-      </w:r>
-      <w:proofErr w:type="spellEnd"/>
-      <w:r>
-        <w:rPr>
-          <w:color w:val="2E5090"/>
-          <w:sz w:val="28"/>
-          <w:szCs w:val="28"/>
-        </w:rPr>
-        <w:t xml:space="preserve"> vs Market Leaders — Updated April 2026</w:t>
+        <w:t>Phishield vs Market Leaders — Updated April 2026</w:t>
       </w:r>
     </w:p>
     <w:p>
@@ -135,85 +125,8 @@
       <w:pPr>
         <w:spacing w:after="120"/>
       </w:pPr>
-      <w:proofErr w:type="spellStart"/>
-      <w:r>
-        <w:t>Phishield</w:t>
-      </w:r>
-      <w:proofErr w:type="spellEnd"/>
-      <w:r>
-        <w:t xml:space="preserve"> is an external passive cyber risk assessment platform for insurance underwriting. It uses Shodan </w:t>
-      </w:r>
-      <w:proofErr w:type="spellStart"/>
-      <w:r>
-        <w:t>InternetDB</w:t>
-      </w:r>
-      <w:proofErr w:type="spellEnd"/>
-      <w:r>
-        <w:t xml:space="preserve"> + full Shodan API, NVD, EPSS, CISA KEV, </w:t>
-      </w:r>
-      <w:proofErr w:type="spellStart"/>
-      <w:r>
-        <w:t>sslyze</w:t>
-      </w:r>
-      <w:proofErr w:type="spellEnd"/>
-      <w:r>
-        <w:t xml:space="preserve">, </w:t>
-      </w:r>
-      <w:proofErr w:type="spellStart"/>
-      <w:r>
-        <w:t>OSV.dev</w:t>
-      </w:r>
-      <w:proofErr w:type="spellEnd"/>
-      <w:r>
-        <w:t xml:space="preserve">, banner grabbing, </w:t>
-      </w:r>
-      <w:proofErr w:type="spellStart"/>
-      <w:r>
-        <w:t>VirusTotal</w:t>
-      </w:r>
-      <w:proofErr w:type="spellEnd"/>
-      <w:r>
-        <w:t xml:space="preserve">, </w:t>
-      </w:r>
-      <w:proofErr w:type="spellStart"/>
-      <w:r>
-        <w:t>SecurityTrails</w:t>
-      </w:r>
-      <w:proofErr w:type="spellEnd"/>
-      <w:r>
-        <w:t xml:space="preserve">, </w:t>
-      </w:r>
-      <w:proofErr w:type="spellStart"/>
-      <w:r>
-        <w:t>Dehashed</w:t>
-      </w:r>
-      <w:proofErr w:type="spellEnd"/>
-      <w:r>
-        <w:t xml:space="preserve"> (v2 API), Hudson Rock, </w:t>
-      </w:r>
-      <w:proofErr w:type="spellStart"/>
-      <w:r>
-        <w:t>IntelX</w:t>
-      </w:r>
-      <w:proofErr w:type="spellEnd"/>
-      <w:r>
-        <w:t>, and HIBP for vulnerability and credential risk detection. Enterprise scanners (Nessus, Qualys, Rapid7) use active authenticated scanning with 100K+ vulnerability tests. Cyber insurance leaders Coalition (</w:t>
-      </w:r>
-      <w:proofErr w:type="spellStart"/>
-      <w:r>
-        <w:t>BinaryEdge</w:t>
-      </w:r>
-      <w:proofErr w:type="spellEnd"/>
-      <w:r>
-        <w:t xml:space="preserve">, </w:t>
-      </w:r>
-      <w:proofErr w:type="spellStart"/>
-      <w:r>
-        <w:t>Wirespeed</w:t>
-      </w:r>
-      <w:proofErr w:type="spellEnd"/>
-      <w:r>
-        <w:t xml:space="preserve"> MDR, Active Data Graph) and CFC (Connect platform, Response app, 20+ years claims data) set the market benchmark. This document tracks implementation status, strategic roadmap, and competitive positioning.</w:t>
+      <w:r>
+        <w:t>Phishield is an external passive cyber risk assessment platform for insurance underwriting. It uses Shodan InternetDB + full Shodan API, NVD, EPSS, CISA KEV, sslyze, OSV.dev, banner grabbing, VirusTotal, SecurityTrails, Dehashed (v2 API), Hudson Rock, IntelX, and HIBP for vulnerability and credential risk detection. Enterprise scanners (Nessus, Qualys, Rapid7) use active authenticated scanning with 100K+ vulnerability tests. Cyber insurance leaders Coalition (BinaryEdge, Wirespeed MDR, Active Data Graph) and CFC (Connect platform, Response app, 20+ years claims data) set the market benchmark. This document tracks implementation status, strategic roadmap, and competitive positioning.</w:t>
       </w:r>
     </w:p>
     <w:p>
@@ -367,23 +280,7 @@
                 <w:sz w:val="18"/>
                 <w:szCs w:val="18"/>
               </w:rPr>
-              <w:t xml:space="preserve">Exploit maturity classification (KEV + EPSS + </w:t>
-            </w:r>
-            <w:proofErr w:type="spellStart"/>
-            <w:r>
-              <w:rPr>
-                <w:sz w:val="18"/>
-                <w:szCs w:val="18"/>
-              </w:rPr>
-              <w:t>ExploitDB</w:t>
-            </w:r>
-            <w:proofErr w:type="spellEnd"/>
-            <w:r>
-              <w:rPr>
-                <w:sz w:val="18"/>
-                <w:szCs w:val="18"/>
-              </w:rPr>
-              <w:t xml:space="preserve"> + Metasploit)</w:t>
+              <w:t>Exploit maturity classification (KEV + EPSS + ExploitDB + Metasploit)</w:t>
             </w:r>
           </w:p>
         </w:tc>
@@ -519,23 +416,7 @@
                 <w:sz w:val="18"/>
                 <w:szCs w:val="18"/>
               </w:rPr>
-              <w:t>Enhanced version detection (</w:t>
-            </w:r>
-            <w:proofErr w:type="spellStart"/>
-            <w:r>
-              <w:rPr>
-                <w:sz w:val="18"/>
-                <w:szCs w:val="18"/>
-              </w:rPr>
-              <w:t>TechStackChecker</w:t>
-            </w:r>
-            <w:proofErr w:type="spellEnd"/>
-            <w:r>
-              <w:rPr>
-                <w:sz w:val="18"/>
-                <w:szCs w:val="18"/>
-              </w:rPr>
-              <w:t xml:space="preserve"> — 29 EOL sigs, jQuery, AngularJS)</w:t>
+              <w:t>Enhanced version detection (TechStackChecker — 29 EOL sigs, jQuery, AngularJS)</w:t>
             </w:r>
           </w:p>
         </w:tc>
@@ -713,21 +594,12 @@
             <w:pPr>
               <w:spacing w:before="40" w:after="40"/>
             </w:pPr>
-            <w:proofErr w:type="spellStart"/>
-            <w:r>
-              <w:rPr>
-                <w:sz w:val="18"/>
-                <w:szCs w:val="18"/>
-              </w:rPr>
-              <w:t>sslyze</w:t>
-            </w:r>
-            <w:proofErr w:type="spellEnd"/>
-            <w:r>
-              <w:rPr>
-                <w:sz w:val="18"/>
-                <w:szCs w:val="18"/>
-              </w:rPr>
-              <w:t xml:space="preserve"> integration (deep cipher/protocol/vulnerability analysis)</w:t>
+            <w:r>
+              <w:rPr>
+                <w:sz w:val="18"/>
+                <w:szCs w:val="18"/>
+              </w:rPr>
+              <w:t>sslyze integration (deep cipher/protocol/vulnerability analysis)</w:t>
             </w:r>
           </w:p>
         </w:tc>
@@ -858,21 +730,12 @@
             <w:pPr>
               <w:spacing w:before="40" w:after="40"/>
             </w:pPr>
-            <w:proofErr w:type="spellStart"/>
-            <w:r>
-              <w:rPr>
-                <w:sz w:val="18"/>
-                <w:szCs w:val="18"/>
-              </w:rPr>
-              <w:t>OSV.dev</w:t>
-            </w:r>
-            <w:proofErr w:type="spellEnd"/>
-            <w:r>
-              <w:rPr>
-                <w:sz w:val="18"/>
-                <w:szCs w:val="18"/>
-              </w:rPr>
-              <w:t xml:space="preserve"> API (version-to-CVE cross-reference with per-IP merging)</w:t>
+            <w:r>
+              <w:rPr>
+                <w:sz w:val="18"/>
+                <w:szCs w:val="18"/>
+              </w:rPr>
+              <w:t>OSV.dev API (version-to-CVE cross-reference with per-IP merging)</w:t>
             </w:r>
           </w:p>
         </w:tc>
@@ -1965,23 +1828,7 @@
                 <w:sz w:val="18"/>
                 <w:szCs w:val="18"/>
               </w:rPr>
-              <w:t xml:space="preserve">CPEs from all IPs fed to </w:t>
-            </w:r>
-            <w:proofErr w:type="spellStart"/>
-            <w:r>
-              <w:rPr>
-                <w:sz w:val="18"/>
-                <w:szCs w:val="18"/>
-              </w:rPr>
-              <w:t>OSV.dev</w:t>
-            </w:r>
-            <w:proofErr w:type="spellEnd"/>
-            <w:r>
-              <w:rPr>
-                <w:sz w:val="18"/>
-                <w:szCs w:val="18"/>
-              </w:rPr>
-              <w:t>, matched CVEs merged back</w:t>
+              <w:t>CPEs from all IPs fed to OSV.dev, matched CVEs merged back</w:t>
             </w:r>
           </w:p>
         </w:tc>
@@ -2039,21 +1886,12 @@
             <w:pPr>
               <w:spacing w:before="40" w:after="40"/>
             </w:pPr>
-            <w:proofErr w:type="spellStart"/>
-            <w:r>
-              <w:rPr>
-                <w:sz w:val="18"/>
-                <w:szCs w:val="18"/>
-              </w:rPr>
-              <w:t>InternetDB</w:t>
-            </w:r>
-            <w:proofErr w:type="spellEnd"/>
-            <w:r>
-              <w:rPr>
-                <w:sz w:val="18"/>
-                <w:szCs w:val="18"/>
-              </w:rPr>
-              <w:t xml:space="preserve"> CPEs + full API org/ASN/banners</w:t>
+            <w:r>
+              <w:rPr>
+                <w:sz w:val="18"/>
+                <w:szCs w:val="18"/>
+              </w:rPr>
+              <w:t>InternetDB CPEs + full API org/ASN/banners</w:t>
             </w:r>
           </w:p>
         </w:tc>
@@ -2157,21 +1995,12 @@
             <w:pPr>
               <w:spacing w:before="40" w:after="40"/>
             </w:pPr>
-            <w:proofErr w:type="spellStart"/>
-            <w:r>
-              <w:rPr>
-                <w:sz w:val="18"/>
-                <w:szCs w:val="18"/>
-              </w:rPr>
-              <w:t>Dehashed</w:t>
-            </w:r>
-            <w:proofErr w:type="spellEnd"/>
-            <w:r>
-              <w:rPr>
-                <w:sz w:val="18"/>
-                <w:szCs w:val="18"/>
-              </w:rPr>
-              <w:t xml:space="preserve"> v2 API</w:t>
+            <w:r>
+              <w:rPr>
+                <w:sz w:val="18"/>
+                <w:szCs w:val="18"/>
+              </w:rPr>
+              <w:t>Dehashed v2 API</w:t>
             </w:r>
           </w:p>
         </w:tc>
@@ -2229,21 +2058,12 @@
             <w:pPr>
               <w:spacing w:before="40" w:after="40"/>
             </w:pPr>
-            <w:proofErr w:type="spellStart"/>
-            <w:r>
-              <w:rPr>
-                <w:sz w:val="18"/>
-                <w:szCs w:val="18"/>
-              </w:rPr>
-              <w:t>VirusTotal</w:t>
-            </w:r>
-            <w:proofErr w:type="spellEnd"/>
-            <w:r>
-              <w:rPr>
-                <w:sz w:val="18"/>
-                <w:szCs w:val="18"/>
-              </w:rPr>
-              <w:t xml:space="preserve"> PDF interpretation</w:t>
+            <w:r>
+              <w:rPr>
+                <w:sz w:val="18"/>
+                <w:szCs w:val="18"/>
+              </w:rPr>
+              <w:t>VirusTotal PDF interpretation</w:t>
             </w:r>
           </w:p>
         </w:tc>
@@ -2746,21 +2566,12 @@
             <w:pPr>
               <w:spacing w:before="40" w:after="40"/>
             </w:pPr>
-            <w:proofErr w:type="spellStart"/>
-            <w:r>
-              <w:rPr>
-                <w:sz w:val="18"/>
-                <w:szCs w:val="18"/>
-              </w:rPr>
-              <w:t>IntelX</w:t>
-            </w:r>
-            <w:proofErr w:type="spellEnd"/>
-            <w:r>
-              <w:rPr>
-                <w:sz w:val="18"/>
-                <w:szCs w:val="18"/>
-              </w:rPr>
-              <w:t xml:space="preserve"> dark web monitoring</w:t>
+            <w:r>
+              <w:rPr>
+                <w:sz w:val="18"/>
+                <w:szCs w:val="18"/>
+              </w:rPr>
+              <w:t>IntelX dark web monitoring</w:t>
             </w:r>
           </w:p>
         </w:tc>
@@ -2819,37 +2630,12 @@
             <w:pPr>
               <w:spacing w:before="40" w:after="40"/>
             </w:pPr>
-            <w:proofErr w:type="spellStart"/>
-            <w:r>
-              <w:rPr>
-                <w:sz w:val="18"/>
-                <w:szCs w:val="18"/>
-              </w:rPr>
-              <w:t>Dehashed</w:t>
-            </w:r>
-            <w:proofErr w:type="spellEnd"/>
-            <w:r>
-              <w:rPr>
-                <w:sz w:val="18"/>
-                <w:szCs w:val="18"/>
-              </w:rPr>
-              <w:t>/</w:t>
-            </w:r>
-            <w:proofErr w:type="spellStart"/>
-            <w:r>
-              <w:rPr>
-                <w:sz w:val="18"/>
-                <w:szCs w:val="18"/>
-              </w:rPr>
-              <w:t>IntelX</w:t>
-            </w:r>
-            <w:proofErr w:type="spellEnd"/>
-            <w:r>
-              <w:rPr>
-                <w:sz w:val="18"/>
-                <w:szCs w:val="18"/>
-              </w:rPr>
-              <w:t xml:space="preserve"> credit toggles</w:t>
+            <w:r>
+              <w:rPr>
+                <w:sz w:val="18"/>
+                <w:szCs w:val="18"/>
+              </w:rPr>
+              <w:t>Dehashed/IntelX credit toggles</w:t>
             </w:r>
           </w:p>
         </w:tc>
@@ -3039,23 +2825,7 @@
                 <w:sz w:val="18"/>
                 <w:szCs w:val="18"/>
               </w:rPr>
-              <w:t xml:space="preserve">CVE </w:t>
-            </w:r>
-            <w:proofErr w:type="gramStart"/>
-            <w:r>
-              <w:rPr>
-                <w:sz w:val="18"/>
-                <w:szCs w:val="18"/>
-              </w:rPr>
-              <w:t>layout</w:t>
-            </w:r>
-            <w:proofErr w:type="gramEnd"/>
-            <w:r>
-              <w:rPr>
-                <w:sz w:val="18"/>
-                <w:szCs w:val="18"/>
-              </w:rPr>
-              <w:t xml:space="preserve"> fix in PDF</w:t>
+              <w:t>CVE layout fix in PDF</w:t>
             </w:r>
           </w:p>
         </w:tc>
@@ -3180,13 +2950,8 @@
       <w:pPr>
         <w:spacing w:after="120"/>
       </w:pPr>
-      <w:proofErr w:type="spellStart"/>
-      <w:r>
-        <w:t>Phishield</w:t>
-      </w:r>
-      <w:proofErr w:type="spellEnd"/>
-      <w:r>
-        <w:t xml:space="preserve"> operates a 4-source credential intelligence pipeline that classifies exposure risk from CRITICAL to LOW:</w:t>
+      <w:r>
+        <w:t>Phishield operates a 4-source credential intelligence pipeline that classifies exposure risk from CRITICAL to LOW:</w:t>
       </w:r>
     </w:p>
     <w:tbl>
@@ -3329,21 +3094,12 @@
             <w:pPr>
               <w:spacing w:before="40" w:after="40"/>
             </w:pPr>
-            <w:proofErr w:type="spellStart"/>
-            <w:r>
-              <w:rPr>
-                <w:sz w:val="18"/>
-                <w:szCs w:val="18"/>
-              </w:rPr>
-              <w:t>Dehashed</w:t>
-            </w:r>
-            <w:proofErr w:type="spellEnd"/>
-            <w:r>
-              <w:rPr>
-                <w:sz w:val="18"/>
-                <w:szCs w:val="18"/>
-              </w:rPr>
-              <w:t xml:space="preserve"> (v2 API)</w:t>
+            <w:r>
+              <w:rPr>
+                <w:sz w:val="18"/>
+                <w:szCs w:val="18"/>
+              </w:rPr>
+              <w:t>Dehashed (v2 API)</w:t>
             </w:r>
           </w:p>
         </w:tc>
@@ -3583,7 +3339,6 @@
             <w:pPr>
               <w:spacing w:before="40" w:after="40"/>
             </w:pPr>
-            <w:proofErr w:type="spellStart"/>
             <w:r>
               <w:rPr>
                 <w:sz w:val="18"/>
@@ -3591,7 +3346,6 @@
               </w:rPr>
               <w:t>IntelX</w:t>
             </w:r>
-            <w:proofErr w:type="spellEnd"/>
           </w:p>
         </w:tc>
         <w:tc>
@@ -3683,23 +3437,7 @@
         <w:spacing w:after="60"/>
       </w:pPr>
       <w:r>
-        <w:t>CRITICAL: Active infostealer detected (Hudson Rock) OR credentials on dark web (</w:t>
-      </w:r>
-      <w:proofErr w:type="spellStart"/>
-      <w:r>
-        <w:t>IntelX</w:t>
-      </w:r>
-      <w:proofErr w:type="spellEnd"/>
-      <w:r>
-        <w:t xml:space="preserve"> </w:t>
-      </w:r>
-      <w:proofErr w:type="spellStart"/>
-      <w:r>
-        <w:t>darkweb_count</w:t>
-      </w:r>
-      <w:proofErr w:type="spellEnd"/>
-      <w:r>
-        <w:t xml:space="preserve"> &gt; 0)</w:t>
+        <w:t>CRITICAL: Active infostealer detected (Hudson Rock) OR credentials on dark web (IntelX darkweb_count &gt; 0)</w:t>
       </w:r>
     </w:p>
     <w:p>
@@ -3712,15 +3450,7 @@
         <w:spacing w:after="60"/>
       </w:pPr>
       <w:r>
-        <w:t>HIGH: Recent breach (&lt;2yr) + password exposed (</w:t>
-      </w:r>
-      <w:proofErr w:type="spellStart"/>
-      <w:r>
-        <w:t>Dehashed</w:t>
-      </w:r>
-      <w:proofErr w:type="spellEnd"/>
-      <w:r>
-        <w:t xml:space="preserve"> + HIBP) OR dark web references</w:t>
+        <w:t>HIGH: Recent breach (&lt;2yr) + password exposed (Dehashed + HIBP) OR dark web references</w:t>
       </w:r>
     </w:p>
     <w:p>
@@ -3759,39 +3489,7 @@
         <w:spacing w:after="120"/>
       </w:pPr>
       <w:r>
-        <w:t xml:space="preserve">Note: </w:t>
-      </w:r>
-      <w:proofErr w:type="spellStart"/>
-      <w:r>
-        <w:t>IntelX</w:t>
-      </w:r>
-      <w:proofErr w:type="spellEnd"/>
-      <w:r>
-        <w:t xml:space="preserve"> trial expires 2026-04-08. Research underway for cost-effective dark web monitoring alternatives (LeakCheck.io $3.99/</w:t>
-      </w:r>
-      <w:proofErr w:type="spellStart"/>
-      <w:r>
-        <w:t>mo</w:t>
-      </w:r>
-      <w:proofErr w:type="spellEnd"/>
-      <w:r>
-        <w:t xml:space="preserve">, </w:t>
-      </w:r>
-      <w:proofErr w:type="spellStart"/>
-      <w:r>
-        <w:t>Snusbase</w:t>
-      </w:r>
-      <w:proofErr w:type="spellEnd"/>
-      <w:r>
-        <w:t xml:space="preserve"> $4.99/</w:t>
-      </w:r>
-      <w:proofErr w:type="spellStart"/>
-      <w:r>
-        <w:t>mo</w:t>
-      </w:r>
-      <w:proofErr w:type="spellEnd"/>
-      <w:r>
-        <w:t>).</w:t>
+        <w:t>Note: IntelX trial expires 2026-04-08. Research underway for cost-effective dark web monitoring alternatives (LeakCheck.io $3.99/mo, Snusbase $4.99/mo).</w:t>
       </w:r>
     </w:p>
     <w:p>
@@ -3814,15 +3512,7 @@
         <w:spacing w:after="120"/>
       </w:pPr>
       <w:r>
-        <w:t xml:space="preserve">Scanner capabilities mapped to the cyber kill chain, identifying what </w:t>
-      </w:r>
-      <w:proofErr w:type="spellStart"/>
-      <w:r>
-        <w:t>Phishield</w:t>
-      </w:r>
-      <w:proofErr w:type="spellEnd"/>
-      <w:r>
-        <w:t xml:space="preserve"> tests at each attack phase:</w:t>
+        <w:t>Scanner capabilities mapped to the cyber kill chain, identifying what Phishield tests at each attack phase:</w:t>
       </w:r>
     </w:p>
     <w:tbl>
@@ -3913,7 +3603,6 @@
             <w:pPr>
               <w:spacing w:before="40" w:after="40"/>
             </w:pPr>
-            <w:proofErr w:type="spellStart"/>
             <w:r>
               <w:rPr>
                 <w:b/>
@@ -3922,18 +3611,7 @@
                 <w:sz w:val="18"/>
                 <w:szCs w:val="18"/>
               </w:rPr>
-              <w:t>Phishield</w:t>
-            </w:r>
-            <w:proofErr w:type="spellEnd"/>
-            <w:r>
-              <w:rPr>
-                <w:b/>
-                <w:bCs/>
-                <w:color w:val="FFFFFF"/>
-                <w:sz w:val="18"/>
-                <w:szCs w:val="18"/>
-              </w:rPr>
-              <w:t xml:space="preserve"> Coverage</w:t>
+              <w:t>Phishield Coverage</w:t>
             </w:r>
           </w:p>
         </w:tc>
@@ -4017,17 +3695,8 @@
                 <w:sz w:val="18"/>
                 <w:szCs w:val="18"/>
               </w:rPr>
-              <w:t xml:space="preserve">STRONG — subdomains, DNS, tech stack, WHOIS, </w:t>
-            </w:r>
-            <w:proofErr w:type="spellStart"/>
-            <w:r>
-              <w:rPr>
-                <w:sz w:val="18"/>
-                <w:szCs w:val="18"/>
-              </w:rPr>
-              <w:t>SecurityTrails</w:t>
-            </w:r>
-            <w:proofErr w:type="spellEnd"/>
+              <w:t>STRONG — subdomains, DNS, tech stack, WHOIS, SecurityTrails</w:t>
+            </w:r>
           </w:p>
         </w:tc>
         <w:tc>
@@ -4109,33 +3778,8 @@
                 <w:sz w:val="18"/>
                 <w:szCs w:val="18"/>
               </w:rPr>
-              <w:t xml:space="preserve">STRONG — fraudulent domains, </w:t>
-            </w:r>
-            <w:proofErr w:type="spellStart"/>
-            <w:r>
-              <w:rPr>
-                <w:sz w:val="18"/>
-                <w:szCs w:val="18"/>
-              </w:rPr>
-              <w:t>Dehashed</w:t>
-            </w:r>
-            <w:proofErr w:type="spellEnd"/>
-            <w:r>
-              <w:rPr>
-                <w:sz w:val="18"/>
-                <w:szCs w:val="18"/>
-              </w:rPr>
-              <w:t xml:space="preserve">, </w:t>
-            </w:r>
-            <w:proofErr w:type="spellStart"/>
-            <w:r>
-              <w:rPr>
-                <w:sz w:val="18"/>
-                <w:szCs w:val="18"/>
-              </w:rPr>
-              <w:t>IntelX</w:t>
-            </w:r>
-            <w:proofErr w:type="spellEnd"/>
+              <w:t>STRONG — fraudulent domains, Dehashed, IntelX</w:t>
+            </w:r>
           </w:p>
         </w:tc>
         <w:tc>
@@ -4279,45 +3923,27 @@
                 <w:sz w:val="18"/>
                 <w:szCs w:val="18"/>
               </w:rPr>
-              <w:t xml:space="preserve">Web app vulns (SQLi, XSS, RCE), </w:t>
-            </w:r>
-            <w:proofErr w:type="spellStart"/>
-            <w:r>
-              <w:rPr>
-                <w:sz w:val="18"/>
-                <w:szCs w:val="18"/>
-              </w:rPr>
-              <w:t>webshells</w:t>
-            </w:r>
-            <w:proofErr w:type="spellEnd"/>
-          </w:p>
-        </w:tc>
-        <w:tc>
-          <w:tcPr>
-            <w:tcW w:w="100" w:type="dxa"/>
-            <w:shd w:val="solid" w:color="F0F4F8" w:fill="F0F4F8"/>
-            <w:vAlign w:val="center"/>
-          </w:tcPr>
-          <w:p>
-            <w:pPr>
-              <w:spacing w:before="40" w:after="40"/>
-            </w:pPr>
-            <w:r>
-              <w:rPr>
-                <w:sz w:val="18"/>
-                <w:szCs w:val="18"/>
-              </w:rPr>
-              <w:t xml:space="preserve">PARTIAL — headers, CVEs, </w:t>
-            </w:r>
-            <w:proofErr w:type="spellStart"/>
-            <w:r>
-              <w:rPr>
-                <w:sz w:val="18"/>
-                <w:szCs w:val="18"/>
-              </w:rPr>
-              <w:t>OSV.dev</w:t>
-            </w:r>
-            <w:proofErr w:type="spellEnd"/>
+              <w:t>Web app vulns (SQLi, XSS, RCE), webshells</w:t>
+            </w:r>
+          </w:p>
+        </w:tc>
+        <w:tc>
+          <w:tcPr>
+            <w:tcW w:w="100" w:type="dxa"/>
+            <w:shd w:val="solid" w:color="F0F4F8" w:fill="F0F4F8"/>
+            <w:vAlign w:val="center"/>
+          </w:tcPr>
+          <w:p>
+            <w:pPr>
+              <w:spacing w:before="40" w:after="40"/>
+            </w:pPr>
+            <w:r>
+              <w:rPr>
+                <w:sz w:val="18"/>
+                <w:szCs w:val="18"/>
+              </w:rPr>
+              <w:t>PARTIAL — headers, CVEs, OSV.dev</w:t>
+            </w:r>
           </w:p>
         </w:tc>
         <w:tc>
@@ -4579,23 +4205,7 @@
                 <w:sz w:val="18"/>
                 <w:szCs w:val="18"/>
               </w:rPr>
-              <w:t xml:space="preserve">DLP, DNS </w:t>
-            </w:r>
-            <w:proofErr w:type="spellStart"/>
-            <w:r>
-              <w:rPr>
-                <w:sz w:val="18"/>
-                <w:szCs w:val="18"/>
-              </w:rPr>
-              <w:t>tunneling</w:t>
-            </w:r>
-            <w:proofErr w:type="spellEnd"/>
-            <w:r>
-              <w:rPr>
-                <w:sz w:val="18"/>
-                <w:szCs w:val="18"/>
-              </w:rPr>
-              <w:t xml:space="preserve"> detection</w:t>
+              <w:t>DLP, DNS tunneling detection</w:t>
             </w:r>
           </w:p>
         </w:tc>
@@ -5206,39 +4816,7 @@
                 <w:sz w:val="18"/>
                 <w:szCs w:val="18"/>
               </w:rPr>
-              <w:t xml:space="preserve">Sensitive file exposure </w:t>
-            </w:r>
-            <w:proofErr w:type="gramStart"/>
-            <w:r>
-              <w:rPr>
-                <w:sz w:val="18"/>
-                <w:szCs w:val="18"/>
-              </w:rPr>
-              <w:t>(.git/.env</w:t>
-            </w:r>
-            <w:proofErr w:type="gramEnd"/>
-            <w:r>
-              <w:rPr>
-                <w:sz w:val="18"/>
-                <w:szCs w:val="18"/>
-              </w:rPr>
-              <w:t>/.</w:t>
-            </w:r>
-            <w:proofErr w:type="spellStart"/>
-            <w:r>
-              <w:rPr>
-                <w:sz w:val="18"/>
-                <w:szCs w:val="18"/>
-              </w:rPr>
-              <w:t>DS_Store</w:t>
-            </w:r>
-            <w:proofErr w:type="spellEnd"/>
-            <w:r>
-              <w:rPr>
-                <w:sz w:val="18"/>
-                <w:szCs w:val="18"/>
-              </w:rPr>
-              <w:t>)</w:t>
+              <w:t>Sensitive file exposure (.git/.env/.DS_Store)</w:t>
             </w:r>
           </w:p>
         </w:tc>
@@ -5324,23 +4902,7 @@
                 <w:sz w:val="18"/>
                 <w:szCs w:val="18"/>
               </w:rPr>
-              <w:t>CMS-specific admin paths (</w:t>
-            </w:r>
-            <w:proofErr w:type="spellStart"/>
-            <w:r>
-              <w:rPr>
-                <w:sz w:val="18"/>
-                <w:szCs w:val="18"/>
-              </w:rPr>
-              <w:t>wp</w:t>
-            </w:r>
-            <w:proofErr w:type="spellEnd"/>
-            <w:r>
-              <w:rPr>
-                <w:sz w:val="18"/>
-                <w:szCs w:val="18"/>
-              </w:rPr>
-              <w:t>-admin, Joomla, Drupal)</w:t>
+              <w:t>CMS-specific admin paths (wp-admin, Joomla, Drupal)</w:t>
             </w:r>
           </w:p>
         </w:tc>
@@ -5427,23 +4989,7 @@
                 <w:sz w:val="18"/>
                 <w:szCs w:val="18"/>
               </w:rPr>
-              <w:t xml:space="preserve">Nuclei integration (OWASP Top 10, </w:t>
-            </w:r>
-            <w:proofErr w:type="spellStart"/>
-            <w:r>
-              <w:rPr>
-                <w:sz w:val="18"/>
-                <w:szCs w:val="18"/>
-              </w:rPr>
-              <w:t>misconfigs</w:t>
-            </w:r>
-            <w:proofErr w:type="spellEnd"/>
-            <w:r>
-              <w:rPr>
-                <w:sz w:val="18"/>
-                <w:szCs w:val="18"/>
-              </w:rPr>
-              <w:t>, default creds)</w:t>
+              <w:t>Nuclei integration (OWASP Top 10, misconfigs, default creds)</w:t>
             </w:r>
           </w:p>
         </w:tc>
@@ -5753,23 +5299,7 @@
                 <w:sz w:val="18"/>
                 <w:szCs w:val="18"/>
               </w:rPr>
-              <w:t xml:space="preserve">2. Broader port scanning (461+ ports matching Coalition </w:t>
-            </w:r>
-            <w:proofErr w:type="spellStart"/>
-            <w:r>
-              <w:rPr>
-                <w:sz w:val="18"/>
-                <w:szCs w:val="18"/>
-              </w:rPr>
-              <w:t>BinaryEdge</w:t>
-            </w:r>
-            <w:proofErr w:type="spellEnd"/>
-            <w:r>
-              <w:rPr>
-                <w:sz w:val="18"/>
-                <w:szCs w:val="18"/>
-              </w:rPr>
-              <w:t>)</w:t>
+              <w:t>2. Broader port scanning (461+ ports matching Coalition BinaryEdge)</w:t>
             </w:r>
           </w:p>
         </w:tc>
@@ -6462,12 +5992,6 @@
                 <w:szCs w:val="18"/>
               </w:rPr>
               <w:t xml:space="preserve">10. Zero-Day Resilience Index (composite score: WAF + EDR detection + MFA + attack surface + </w:t>
-            </w:r>
-            <w:r>
-              <w:rPr>
-                <w:sz w:val="18"/>
-                <w:szCs w:val="18"/>
-              </w:rPr>
               <w:lastRenderedPageBreak/>
               <w:t>patch cadence + segmentation)</w:t>
             </w:r>
@@ -7121,74 +6645,26 @@
                 <w:sz w:val="18"/>
                 <w:szCs w:val="18"/>
               </w:rPr>
-              <w:t xml:space="preserve">Continuous dark web monitoring (replace </w:t>
-            </w:r>
-            <w:proofErr w:type="spellStart"/>
-            <w:r>
-              <w:rPr>
-                <w:sz w:val="18"/>
-                <w:szCs w:val="18"/>
-              </w:rPr>
-              <w:t>IntelX</w:t>
-            </w:r>
-            <w:proofErr w:type="spellEnd"/>
-            <w:r>
-              <w:rPr>
-                <w:sz w:val="18"/>
-                <w:szCs w:val="18"/>
-              </w:rPr>
-              <w:t xml:space="preserve"> trial)</w:t>
-            </w:r>
-          </w:p>
-        </w:tc>
-        <w:tc>
-          <w:tcPr>
-            <w:tcW w:w="100" w:type="dxa"/>
-            <w:shd w:val="solid" w:color="F0F4F8" w:fill="F0F4F8"/>
-            <w:vAlign w:val="center"/>
-          </w:tcPr>
-          <w:p>
-            <w:pPr>
-              <w:spacing w:before="40" w:after="40"/>
-            </w:pPr>
-            <w:r>
-              <w:rPr>
-                <w:sz w:val="18"/>
-                <w:szCs w:val="18"/>
-              </w:rPr>
-              <w:t>Cost-effective API (</w:t>
-            </w:r>
-            <w:proofErr w:type="spellStart"/>
-            <w:r>
-              <w:rPr>
-                <w:sz w:val="18"/>
-                <w:szCs w:val="18"/>
-              </w:rPr>
-              <w:t>LeakCheck</w:t>
-            </w:r>
-            <w:proofErr w:type="spellEnd"/>
-            <w:r>
-              <w:rPr>
-                <w:sz w:val="18"/>
-                <w:szCs w:val="18"/>
-              </w:rPr>
-              <w:t xml:space="preserve">, </w:t>
-            </w:r>
-            <w:proofErr w:type="spellStart"/>
-            <w:r>
-              <w:rPr>
-                <w:sz w:val="18"/>
-                <w:szCs w:val="18"/>
-              </w:rPr>
-              <w:t>Snusbase</w:t>
-            </w:r>
-            <w:proofErr w:type="spellEnd"/>
-            <w:r>
-              <w:rPr>
-                <w:sz w:val="18"/>
-                <w:szCs w:val="18"/>
-              </w:rPr>
-              <w:t>, or similar)</w:t>
+              <w:t>Continuous dark web monitoring (replace IntelX trial)</w:t>
+            </w:r>
+          </w:p>
+        </w:tc>
+        <w:tc>
+          <w:tcPr>
+            <w:tcW w:w="100" w:type="dxa"/>
+            <w:shd w:val="solid" w:color="F0F4F8" w:fill="F0F4F8"/>
+            <w:vAlign w:val="center"/>
+          </w:tcPr>
+          <w:p>
+            <w:pPr>
+              <w:spacing w:before="40" w:after="40"/>
+            </w:pPr>
+            <w:r>
+              <w:rPr>
+                <w:sz w:val="18"/>
+                <w:szCs w:val="18"/>
+              </w:rPr>
+              <w:t>Cost-effective API (LeakCheck, Snusbase, or similar)</w:t>
             </w:r>
           </w:p>
         </w:tc>
@@ -7487,23 +6963,7 @@
         <w:spacing w:after="120"/>
       </w:pPr>
       <w:r>
-        <w:t xml:space="preserve">Zero-day vulnerabilities cannot be scanned for directly — they are </w:t>
-      </w:r>
-      <w:proofErr w:type="gramStart"/>
-      <w:r>
-        <w:t>unknown by definition</w:t>
-      </w:r>
-      <w:proofErr w:type="gramEnd"/>
-      <w:r>
-        <w:t xml:space="preserve">. However, </w:t>
-      </w:r>
-      <w:proofErr w:type="spellStart"/>
-      <w:r>
-        <w:t>Phishield</w:t>
-      </w:r>
-      <w:proofErr w:type="spellEnd"/>
-      <w:r>
-        <w:t xml:space="preserve"> can measure an organisation’s RESILIENCE to zero-day exploitation by assessing how many defensive layers an attacker must bypass:</w:t>
+        <w:t>Zero-day vulnerabilities cannot be scanned for directly — they are unknown by definition. However, Phishield can measure an organisation’s RESILIENCE to zero-day exploitation by assessing how many defensive layers an attacker must bypass:</w:t>
       </w:r>
     </w:p>
     <w:tbl>
@@ -7579,29 +7039,7 @@
                 <w:sz w:val="18"/>
                 <w:szCs w:val="18"/>
               </w:rPr>
-              <w:t xml:space="preserve">What </w:t>
-            </w:r>
-            <w:proofErr w:type="spellStart"/>
-            <w:r>
-              <w:rPr>
-                <w:b/>
-                <w:bCs/>
-                <w:color w:val="FFFFFF"/>
-                <w:sz w:val="18"/>
-                <w:szCs w:val="18"/>
-              </w:rPr>
-              <w:t>Phishield</w:t>
-            </w:r>
-            <w:proofErr w:type="spellEnd"/>
-            <w:r>
-              <w:rPr>
-                <w:b/>
-                <w:bCs/>
-                <w:color w:val="FFFFFF"/>
-                <w:sz w:val="18"/>
-                <w:szCs w:val="18"/>
-              </w:rPr>
-              <w:t xml:space="preserve"> Checks</w:t>
+              <w:t>What Phishield Checks</w:t>
             </w:r>
           </w:p>
         </w:tc>
@@ -7731,23 +7169,7 @@
                 <w:sz w:val="18"/>
                 <w:szCs w:val="18"/>
               </w:rPr>
-              <w:t>CrowdStrike/</w:t>
-            </w:r>
-            <w:proofErr w:type="spellStart"/>
-            <w:r>
-              <w:rPr>
-                <w:sz w:val="18"/>
-                <w:szCs w:val="18"/>
-              </w:rPr>
-              <w:t>SentinelOne</w:t>
-            </w:r>
-            <w:proofErr w:type="spellEnd"/>
-            <w:r>
-              <w:rPr>
-                <w:sz w:val="18"/>
-                <w:szCs w:val="18"/>
-              </w:rPr>
-              <w:t>/Sophos Intercept X (detectable via headers/DNS)</w:t>
+              <w:t>CrowdStrike/SentinelOne/Sophos Intercept X (detectable via headers/DNS)</w:t>
             </w:r>
           </w:p>
         </w:tc>
@@ -8171,15 +7593,7 @@
         <w:spacing w:after="120"/>
       </w:pPr>
       <w:r>
-        <w:t xml:space="preserve">This approach aligns with how Coalition assesses risk: they don’t scan for specific zero-days either, but their Active Data Graph models the probability and expected impact of unknown threats based on the target’s defensive posture. </w:t>
-      </w:r>
-      <w:proofErr w:type="spellStart"/>
-      <w:r>
-        <w:t>Phishield’s</w:t>
-      </w:r>
-      <w:proofErr w:type="spellEnd"/>
-      <w:r>
-        <w:t xml:space="preserve"> Zero-Day Resilience Index would provide equivalent insight for SA market underwriting.</w:t>
+        <w:t>This approach aligns with how Coalition assesses risk: they don’t scan for specific zero-days either, but their Active Data Graph models the probability and expected impact of unknown threats based on the target’s defensive posture. Phishield’s Zero-Day Resilience Index would provide equivalent insight for SA market underwriting.</w:t>
       </w:r>
     </w:p>
     <w:p>
@@ -8220,23 +7634,7 @@
         <w:spacing w:after="60"/>
       </w:pPr>
       <w:r>
-        <w:t>4-source credential intelligence pipeline (</w:t>
-      </w:r>
-      <w:proofErr w:type="spellStart"/>
-      <w:r>
-        <w:t>Dehashed</w:t>
-      </w:r>
-      <w:proofErr w:type="spellEnd"/>
-      <w:r>
-        <w:t xml:space="preserve"> + HIBP + Hudson Rock + </w:t>
-      </w:r>
-      <w:proofErr w:type="spellStart"/>
-      <w:r>
-        <w:t>IntelX</w:t>
-      </w:r>
-      <w:proofErr w:type="spellEnd"/>
-      <w:r>
-        <w:t>) with CRITICAL/HIGH/MEDIUM/LOW classification</w:t>
+        <w:t>4-source credential intelligence pipeline (Dehashed + HIBP + Hudson Rock + IntelX) with CRITICAL/HIGH/MEDIUM/LOW classification</w:t>
       </w:r>
     </w:p>
     <w:p>
@@ -8262,23 +7660,7 @@
         <w:spacing w:after="60"/>
       </w:pPr>
       <w:r>
-        <w:t xml:space="preserve">Combined Shodan </w:t>
-      </w:r>
-      <w:proofErr w:type="spellStart"/>
-      <w:r>
-        <w:t>InternetDB</w:t>
-      </w:r>
-      <w:proofErr w:type="spellEnd"/>
-      <w:r>
-        <w:t xml:space="preserve"> + full API + </w:t>
-      </w:r>
-      <w:proofErr w:type="spellStart"/>
-      <w:r>
-        <w:t>OSV.dev</w:t>
-      </w:r>
-      <w:proofErr w:type="spellEnd"/>
-      <w:r>
-        <w:t xml:space="preserve"> CVE enrichment with EPSS/KEV</w:t>
+        <w:t>Combined Shodan InternetDB + full API + OSV.dev CVE enrichment with EPSS/KEV</w:t>
       </w:r>
     </w:p>
     <w:p>
@@ -8290,13 +7672,8 @@
         </w:numPr>
         <w:spacing w:after="60"/>
       </w:pPr>
-      <w:proofErr w:type="gramStart"/>
-      <w:r>
-        <w:t>Attacker</w:t>
-      </w:r>
-      <w:proofErr w:type="gramEnd"/>
-      <w:r>
-        <w:t xml:space="preserve"> kill chain narrative in executive summary (4-phase, colour-coded)</w:t>
+      <w:r>
+        <w:t>Attacker kill chain narrative in executive summary (4-phase, colour-coded)</w:t>
       </w:r>
     </w:p>
     <w:p>
@@ -8322,15 +7699,7 @@
         <w:spacing w:after="60"/>
       </w:pPr>
       <w:r>
-        <w:t xml:space="preserve">Deep SSL/TLS via </w:t>
-      </w:r>
-      <w:proofErr w:type="spellStart"/>
-      <w:r>
-        <w:t>sslyze</w:t>
-      </w:r>
-      <w:proofErr w:type="spellEnd"/>
-      <w:r>
-        <w:t xml:space="preserve"> + service version detection via banner grabbing</w:t>
+        <w:t>Deep SSL/TLS via sslyze + service version detection via banner grabbing</w:t>
       </w:r>
     </w:p>
     <w:p>
@@ -8369,45 +7738,8 @@
         <w:spacing w:after="60"/>
       </w:pPr>
       <w:r>
-        <w:t xml:space="preserve">10 API integrations: Shodan, </w:t>
-      </w:r>
-      <w:proofErr w:type="spellStart"/>
-      <w:r>
-        <w:t>VirusTotal</w:t>
-      </w:r>
-      <w:proofErr w:type="spellEnd"/>
-      <w:r>
-        <w:t xml:space="preserve">, </w:t>
-      </w:r>
-      <w:proofErr w:type="spellStart"/>
-      <w:r>
-        <w:t>SecurityTrails</w:t>
-      </w:r>
-      <w:proofErr w:type="spellEnd"/>
-      <w:r>
-        <w:t xml:space="preserve">, </w:t>
-      </w:r>
-      <w:proofErr w:type="spellStart"/>
-      <w:r>
-        <w:t>Dehashed</w:t>
-      </w:r>
-      <w:proofErr w:type="spellEnd"/>
-      <w:r>
-        <w:t xml:space="preserve"> v2, Hudson Rock, </w:t>
-      </w:r>
-      <w:proofErr w:type="spellStart"/>
-      <w:r>
-        <w:t>IntelX</w:t>
-      </w:r>
-      <w:proofErr w:type="spellEnd"/>
-      <w:r>
-        <w:t xml:space="preserve">, HIBP, CISA KEV, FIRST.org EPSS, </w:t>
-      </w:r>
-      <w:proofErr w:type="spellStart"/>
-      <w:r>
-        <w:t>OSV.dev</w:t>
-      </w:r>
-      <w:proofErr w:type="spellEnd"/>
+        <w:t>10 API integrations: Shodan, VirusTotal, SecurityTrails, Dehashed v2, Hudson Rock, IntelX, HIBP, CISA KEV, FIRST.org EPSS, OSV.dev</w:t>
+      </w:r>
     </w:p>
     <w:p>
       <w:pPr>
@@ -8432,15 +7764,7 @@
         <w:spacing w:after="120"/>
       </w:pPr>
       <w:r>
-        <w:t xml:space="preserve">After completing Phases 1–2 and 27 additional enhancements, </w:t>
-      </w:r>
-      <w:proofErr w:type="spellStart"/>
-      <w:r>
-        <w:t>Phishield</w:t>
-      </w:r>
-      <w:proofErr w:type="spellEnd"/>
-      <w:r>
-        <w:t xml:space="preserve"> offers the most comprehensive external scanner in the Tier 3 category. The credential intelligence pipeline (4 sources), attacker kill chain analysis, and Monte Carlo FAIR model are differentiators not found in competing products at this price point. The SA-specific POPIA compliance mapping is unique to the market.</w:t>
+        <w:t>After completing Phases 1–2 and 27 additional enhancements, Phishield offers the most comprehensive external scanner in the Tier 3 category. The credential intelligence pipeline (4 sources), attacker kill chain analysis, and Monte Carlo FAIR model are differentiators not found in competing products at this price point. The SA-specific POPIA compliance mapping is unique to the market.</w:t>
       </w:r>
     </w:p>
     <w:p>
@@ -8448,15 +7772,7 @@
         <w:spacing w:after="120"/>
       </w:pPr>
       <w:r>
-        <w:t xml:space="preserve">The primary gaps versus Coalition and CFC are: (1) continuous monitoring — both competitors provide ongoing automated rescanning with real-time alerts, (2) claims data feedback — both use actual loss data to calibrate risk models, (3) incident response integration. Closing Phase 4 items 1, 7–10 (continuous monitoring, remediation tracking, dynamic re-prioritisation, Sophos feeds, Zero-Day Resilience Index) would position </w:t>
-      </w:r>
-      <w:proofErr w:type="spellStart"/>
-      <w:r>
-        <w:t>Phishield</w:t>
-      </w:r>
-      <w:proofErr w:type="spellEnd"/>
-      <w:r>
-        <w:t xml:space="preserve"> as a true insurance technology platform rather than a point-in-time scanner.</w:t>
+        <w:t>The primary gaps versus Coalition and CFC are: (1) continuous monitoring — both competitors provide ongoing automated rescanning with real-time alerts, (2) claims data feedback — both use actual loss data to calibrate risk models, (3) incident response integration. Closing Phase 4 items 1, 7–10 (continuous monitoring, remediation tracking, dynamic re-prioritisation, Sophos feeds, Zero-Day Resilience Index) would position Phishield as a true insurance technology platform rather than a point-in-time scanner.</w:t>
       </w:r>
     </w:p>
     <w:p>
@@ -8818,33 +8134,8 @@
                 <w:sz w:val="18"/>
                 <w:szCs w:val="18"/>
               </w:rPr>
-              <w:t xml:space="preserve">Black Kite, </w:t>
-            </w:r>
-            <w:proofErr w:type="spellStart"/>
-            <w:r>
-              <w:rPr>
-                <w:sz w:val="18"/>
-                <w:szCs w:val="18"/>
-              </w:rPr>
-              <w:t>SecurityScorecard</w:t>
-            </w:r>
-            <w:proofErr w:type="spellEnd"/>
-            <w:r>
-              <w:rPr>
-                <w:sz w:val="18"/>
-                <w:szCs w:val="18"/>
-              </w:rPr>
-              <w:t xml:space="preserve">, </w:t>
-            </w:r>
-            <w:proofErr w:type="spellStart"/>
-            <w:r>
-              <w:rPr>
-                <w:sz w:val="18"/>
-                <w:szCs w:val="18"/>
-              </w:rPr>
-              <w:t>Phishield</w:t>
-            </w:r>
-            <w:proofErr w:type="spellEnd"/>
+              <w:t>Black Kite, SecurityScorecard, Phishield</w:t>
+            </w:r>
           </w:p>
         </w:tc>
         <w:tc>
@@ -8960,27 +8251,17 @@
       <w:pPr>
         <w:spacing w:after="120"/>
       </w:pPr>
-      <w:proofErr w:type="spellStart"/>
       <w:r>
         <w:lastRenderedPageBreak/>
-        <w:t>Phishield</w:t>
-      </w:r>
-      <w:proofErr w:type="spellEnd"/>
-      <w:r>
-        <w:t xml:space="preserve"> operates at the top of Tier 3, approaching Tier 4 capability on scanning depth and credential intelligence. The gap to Tier 4 is primarily continuous monitoring, claims data feedback, and incident response — not scanning breadth or intelligence sourcing.</w:t>
+        <w:t>Phishield operates at the top of Tier 3, approaching Tier 4 capability on scanning depth and credential intelligence. The gap to Tier 4 is primarily continuous monitoring, claims data feedback, and incident response — not scanning breadth or intelligence sourcing.</w:t>
       </w:r>
     </w:p>
     <w:p>
       <w:pPr>
         <w:spacing w:after="120"/>
       </w:pPr>
-      <w:proofErr w:type="spellStart"/>
-      <w:r>
-        <w:t>Phishield’s</w:t>
-      </w:r>
-      <w:proofErr w:type="spellEnd"/>
-      <w:r>
-        <w:t xml:space="preserve"> unique value proposition for the South African market: SA-specific FAIR model in ZAR with Monte Carlo confidence intervals, POPIA compliance mapping, 4-source credential intelligence with dark web monitoring, attacker kill chain analysis, and a potential Sophos Central integration for real-time threat intelligence — all designed specifically for cyber insurance underwriting.</w:t>
+      <w:r>
+        <w:t>Phishield’s unique value proposition for the South African market: SA-specific FAIR model in ZAR with Monte Carlo confidence intervals, POPIA compliance mapping, 4-source credential intelligence with dark web monitoring, attacker kill chain analysis, and a potential Sophos Central integration for real-time threat intelligence — all designed specifically for cyber insurance underwriting.</w:t>
       </w:r>
     </w:p>
     <w:p>
@@ -10536,7 +9817,7 @@
         <w:t>4h:</w:t>
       </w:r>
       <w:r>
-        <w:t xml:space="preserve"> Exploit Window metric — calculate Mean-Time-To-Remediate (MTTR) from CVE age data versus the AI discovery speed baseline. Quantifies how quickly the organisation responds relative to AI-era threat velocity.</w:t>
+        <w:t xml:space="preserve"> Exploit Window narrative enhancement (downgraded from standalone metric) — add a contextual sentence to the existing patch management narrative in the PDF noting MTTR relative to AI-era discovery speed. Testing showed that comparing MTTR against speculative “AI hours” is not measurable or actionable as a discrete metric. Effort: Low.</w:t>
       </w:r>
     </w:p>
     <w:p>
@@ -10559,7 +9840,37 @@
         <w:t>5i:</w:t>
       </w:r>
       <w:r>
-        <w:t xml:space="preserve"> AI Threat Readiness section — new report section assessing organisational preparedness for AI-era threats. Factors: EDR with AI/ML capabilities, autonomous patching, AI vulnerability scanning, Glasswing partnership status, patch cadence vs AI discovery speed. No competitor currently offers this.</w:t>
+        <w:t xml:space="preserve"> AI Threat Readiness section (split into two tiers):</w:t>
+      </w:r>
+    </w:p>
+    <w:p>
+      <w:pPr>
+        <w:pStyle w:val="ListParagraph"/>
+        <w:ind w:left="1440"/>
+      </w:pPr>
+      <w:r>
+        <w:rPr>
+          <w:b/>
+        </w:rPr>
+        <w:t>Tier 1 — Externally observable (automated):</w:t>
+      </w:r>
+      <w:r>
+        <w:t xml:space="preserve"> EDR vendor detection via DNS/headers, patch cadence score (already measured), Glasswing partner lookup (public list), bug bounty programme detection (HackerOne/Bugcrowd), security.txt/VDP (already checked), CDN/WAF auto-patching capability.</w:t>
+      </w:r>
+    </w:p>
+    <w:p>
+      <w:pPr>
+        <w:pStyle w:val="ListParagraph"/>
+        <w:ind w:left="1440"/>
+      </w:pPr>
+      <w:r>
+        <w:rPr>
+          <w:b/>
+        </w:rPr>
+        <w:t>Tier 2 — Self-reported (questionnaire):</w:t>
+      </w:r>
+      <w:r>
+        <w:t xml:space="preserve"> New underwriting questions at scan start (similar to SME Rating Engine Q1–Q9): “Does the org use AI-assisted vulnerability scanning?”, “Does the org have autonomous patch deployment?”, “Internal endpoint protection vendor?”. These feed into RSI as user inputs, not discovered by scanner. No competitor currently offers this two-tier approach.</w:t>
       </w:r>
     </w:p>
     <w:p>
@@ -10854,7 +10165,7 @@
           </w:tcPr>
           <w:p>
             <w:r>
-              <w:t>Exploit Window / MTTR metric (4h)</w:t>
+              <w:t>Exploit Window narrative addition (4h, downgraded)</w:t>
             </w:r>
           </w:p>
         </w:tc>
@@ -10874,6 +10185,48 @@
           </w:tcPr>
           <w:p>
             <w:r>
+              <w:t>Medium (narrative only)</w:t>
+            </w:r>
+          </w:p>
+        </w:tc>
+      </w:tr>
+      <w:tr>
+        <w:tc>
+          <w:tcPr>
+            <w:tcW w:type="dxa" w:w="2256"/>
+          </w:tcPr>
+          <w:p>
+            <w:r>
+              <w:t>3</w:t>
+            </w:r>
+          </w:p>
+        </w:tc>
+        <w:tc>
+          <w:tcPr>
+            <w:tcW w:type="dxa" w:w="2256"/>
+          </w:tcPr>
+          <w:p>
+            <w:r>
+              <w:t>RSI AI-readiness factors (6g)</w:t>
+            </w:r>
+          </w:p>
+        </w:tc>
+        <w:tc>
+          <w:tcPr>
+            <w:tcW w:type="dxa" w:w="2256"/>
+          </w:tcPr>
+          <w:p>
+            <w:r>
+              <w:t>Low</w:t>
+            </w:r>
+          </w:p>
+        </w:tc>
+        <w:tc>
+          <w:tcPr>
+            <w:tcW w:type="dxa" w:w="2256"/>
+          </w:tcPr>
+          <w:p>
+            <w:r>
               <w:t>High</w:t>
             </w:r>
           </w:p>
@@ -10886,7 +10239,7 @@
           </w:tcPr>
           <w:p>
             <w:r>
-              <w:t>3</w:t>
+              <w:t>4</w:t>
             </w:r>
           </w:p>
         </w:tc>
@@ -10896,7 +10249,7 @@
           </w:tcPr>
           <w:p>
             <w:r>
-              <w:t>RSI AI-readiness factors (6g)</w:t>
+              <w:t>AI Threat Readiness Tier 1 — externally observable (5i-T1)</w:t>
             </w:r>
           </w:p>
         </w:tc>
@@ -10906,6 +10259,48 @@
           </w:tcPr>
           <w:p>
             <w:r>
+              <w:t>Medium</w:t>
+            </w:r>
+          </w:p>
+        </w:tc>
+        <w:tc>
+          <w:tcPr>
+            <w:tcW w:type="dxa" w:w="2256"/>
+          </w:tcPr>
+          <w:p>
+            <w:r>
+              <w:t>Very High — differentiator</w:t>
+            </w:r>
+          </w:p>
+        </w:tc>
+      </w:tr>
+      <w:tr>
+        <w:tc>
+          <w:tcPr>
+            <w:tcW w:type="dxa" w:w="2256"/>
+          </w:tcPr>
+          <w:p>
+            <w:r>
+              <w:t>5</w:t>
+            </w:r>
+          </w:p>
+        </w:tc>
+        <w:tc>
+          <w:tcPr>
+            <w:tcW w:type="dxa" w:w="2256"/>
+          </w:tcPr>
+          <w:p>
+            <w:r>
+              <w:t>AI Threat Readiness Tier 2 — self-reported questionnaire (5i-T2)</w:t>
+            </w:r>
+          </w:p>
+        </w:tc>
+        <w:tc>
+          <w:tcPr>
+            <w:tcW w:type="dxa" w:w="2256"/>
+          </w:tcPr>
+          <w:p>
+            <w:r>
               <w:t>Low</w:t>
             </w:r>
           </w:p>
@@ -10916,6 +10311,48 @@
           </w:tcPr>
           <w:p>
             <w:r>
+              <w:t>High — enriches RSI</w:t>
+            </w:r>
+          </w:p>
+        </w:tc>
+      </w:tr>
+      <w:tr>
+        <w:tc>
+          <w:tcPr>
+            <w:tcW w:type="dxa" w:w="2256"/>
+          </w:tcPr>
+          <w:p>
+            <w:r>
+              <w:t>6</w:t>
+            </w:r>
+          </w:p>
+        </w:tc>
+        <w:tc>
+          <w:tcPr>
+            <w:tcW w:type="dxa" w:w="2256"/>
+          </w:tcPr>
+          <w:p>
+            <w:r>
+              <w:t>FAIR model AI frequency multiplier (6f)</w:t>
+            </w:r>
+          </w:p>
+        </w:tc>
+        <w:tc>
+          <w:tcPr>
+            <w:tcW w:type="dxa" w:w="2256"/>
+          </w:tcPr>
+          <w:p>
+            <w:r>
+              <w:t>Medium</w:t>
+            </w:r>
+          </w:p>
+        </w:tc>
+        <w:tc>
+          <w:tcPr>
+            <w:tcW w:type="dxa" w:w="2256"/>
+          </w:tcPr>
+          <w:p>
+            <w:r>
               <w:t>High</w:t>
             </w:r>
           </w:p>
@@ -10928,7 +10365,7 @@
           </w:tcPr>
           <w:p>
             <w:r>
-              <w:t>4</w:t>
+              <w:t>7</w:t>
             </w:r>
           </w:p>
         </w:tc>
@@ -10938,7 +10375,7 @@
           </w:tcPr>
           <w:p>
             <w:r>
-              <w:t>AI Threat Readiness report section (5i)</w:t>
+              <w:t>AI-powered scan interpretation (5j)</w:t>
             </w:r>
           </w:p>
         </w:tc>
@@ -10958,91 +10395,392 @@
           </w:tcPr>
           <w:p>
             <w:r>
-              <w:t>Very High — differentiator</w:t>
-            </w:r>
-          </w:p>
-        </w:tc>
-      </w:tr>
-      <w:tr>
-        <w:tc>
-          <w:tcPr>
-            <w:tcW w:type="dxa" w:w="2256"/>
-          </w:tcPr>
-          <w:p>
-            <w:r>
-              <w:t>5</w:t>
-            </w:r>
-          </w:p>
-        </w:tc>
-        <w:tc>
-          <w:tcPr>
-            <w:tcW w:type="dxa" w:w="2256"/>
-          </w:tcPr>
-          <w:p>
-            <w:r>
-              <w:t>FAIR model AI frequency multiplier (6f)</w:t>
-            </w:r>
-          </w:p>
-        </w:tc>
-        <w:tc>
-          <w:tcPr>
-            <w:tcW w:type="dxa" w:w="2256"/>
-          </w:tcPr>
-          <w:p>
-            <w:r>
               <w:t>Medium</w:t>
             </w:r>
           </w:p>
         </w:tc>
-        <w:tc>
-          <w:tcPr>
-            <w:tcW w:type="dxa" w:w="2256"/>
-          </w:tcPr>
-          <w:p>
-            <w:r>
-              <w:t>High</w:t>
-            </w:r>
-          </w:p>
-        </w:tc>
-      </w:tr>
-      <w:tr>
-        <w:tc>
-          <w:tcPr>
-            <w:tcW w:type="dxa" w:w="2256"/>
-          </w:tcPr>
-          <w:p>
-            <w:r>
-              <w:t>6</w:t>
-            </w:r>
-          </w:p>
-        </w:tc>
-        <w:tc>
-          <w:tcPr>
-            <w:tcW w:type="dxa" w:w="2256"/>
-          </w:tcPr>
-          <w:p>
-            <w:r>
-              <w:t>AI-powered scan interpretation (5j)</w:t>
-            </w:r>
-          </w:p>
-        </w:tc>
-        <w:tc>
-          <w:tcPr>
-            <w:tcW w:type="dxa" w:w="2256"/>
-          </w:tcPr>
-          <w:p>
-            <w:r>
-              <w:t>Medium</w:t>
-            </w:r>
-          </w:p>
-        </w:tc>
-        <w:tc>
-          <w:tcPr>
-            <w:tcW w:type="dxa" w:w="2256"/>
-          </w:tcPr>
-          <w:p>
-            <w:r>
-              <w:t>Medium</w:t>
+      </w:tr>
+    </w:tbl>
+    <w:p>
+      <w:pPr>
+        <w:spacing w:before="240" w:after="80"/>
+      </w:pPr>
+      <w:r>
+        <w:rPr>
+          <w:b/>
+          <w:color w:val="1B2A4A"/>
+          <w:sz w:val="26"/>
+        </w:rPr>
+        <w:t>12.5 What CAN vs CANNOT Be Detected Externally</w:t>
+      </w:r>
+    </w:p>
+    <w:p>
+      <w:pPr/>
+      <w:r>
+        <w:t>A core design constraint for Phishield is the distinction between signals that can be discovered through external scanning and those that require self-reporting by the organisation. This distinction directly informs the Tier 1 / Tier 2 split in item 5i above.</w:t>
+      </w:r>
+    </w:p>
+    <w:p>
+      <w:pPr>
+        <w:spacing w:before="120" w:after="60"/>
+      </w:pPr>
+      <w:r>
+        <w:rPr>
+          <w:b/>
+        </w:rPr>
+        <w:t>CAN Detect Externally (Tier 1 — Automated)</w:t>
+      </w:r>
+    </w:p>
+    <w:tbl>
+      <w:tblPr>
+        <w:tblW w:type="auto" w:w="0"/>
+        <w:tblLook w:firstColumn="1" w:firstRow="1" w:lastColumn="0" w:lastRow="0" w:noHBand="0" w:noVBand="1" w:val="04A0"/>
+        <w:tblBorders>
+          <w:top w:val="single" w:sz="4" w:space="0" w:color="auto"/>
+          <w:left w:val="single" w:sz="4" w:space="0" w:color="auto"/>
+          <w:bottom w:val="single" w:sz="4" w:space="0" w:color="auto"/>
+          <w:right w:val="single" w:sz="4" w:space="0" w:color="auto"/>
+          <w:insideH w:val="single" w:sz="4" w:space="0" w:color="auto"/>
+          <w:insideV w:val="single" w:sz="4" w:space="0" w:color="auto"/>
+        </w:tblBorders>
+        <w:tblW w:w="5000" w:type="pct"/>
+      </w:tblPr>
+      <w:tblGrid>
+        <w:gridCol w:w="3008"/>
+        <w:gridCol w:w="6016"/>
+      </w:tblGrid>
+      <w:tr>
+        <w:tc>
+          <w:tcPr>
+            <w:tcW w:type="dxa" w:w="3008"/>
+            <w:shd w:fill="1B2A4A"/>
+          </w:tcPr>
+          <w:p>
+            <w:r>
+              <w:rPr>
+                <w:b/>
+                <w:color w:val="FFFFFF"/>
+              </w:rPr>
+              <w:t>Signal</w:t>
+            </w:r>
+          </w:p>
+        </w:tc>
+        <w:tc>
+          <w:tcPr>
+            <w:tcW w:type="dxa" w:w="6016"/>
+            <w:shd w:fill="1B2A4A"/>
+          </w:tcPr>
+          <w:p>
+            <w:r>
+              <w:rPr>
+                <w:b/>
+                <w:color w:val="FFFFFF"/>
+              </w:rPr>
+              <w:t>Detection Method</w:t>
+            </w:r>
+          </w:p>
+        </w:tc>
+      </w:tr>
+      <w:tr>
+        <w:tc>
+          <w:tcPr>
+            <w:tcW w:type="dxa" w:w="3008"/>
+          </w:tcPr>
+          <w:p>
+            <w:r>
+              <w:t>EDR vendor</w:t>
+            </w:r>
+          </w:p>
+        </w:tc>
+        <w:tc>
+          <w:tcPr>
+            <w:tcW w:type="dxa" w:w="6016"/>
+          </w:tcPr>
+          <w:p>
+            <w:r>
+              <w:t>DNS records, HTTP response headers (e.g. CrowdStrike Falcon, SentinelOne agent signatures)</w:t>
+            </w:r>
+          </w:p>
+        </w:tc>
+      </w:tr>
+      <w:tr>
+        <w:tc>
+          <w:tcPr>
+            <w:tcW w:type="dxa" w:w="3008"/>
+          </w:tcPr>
+          <w:p>
+            <w:r>
+              <w:t>Patch cadence</w:t>
+            </w:r>
+          </w:p>
+        </w:tc>
+        <w:tc>
+          <w:tcPr>
+            <w:tcW w:type="dxa" w:w="6016"/>
+          </w:tcPr>
+          <w:p>
+            <w:r>
+              <w:t>CVE age analysis — time between CVE publication and observed remediation</w:t>
+            </w:r>
+          </w:p>
+        </w:tc>
+      </w:tr>
+      <w:tr>
+        <w:tc>
+          <w:tcPr>
+            <w:tcW w:type="dxa" w:w="3008"/>
+          </w:tcPr>
+          <w:p>
+            <w:r>
+              <w:t>Cloud security posture / CDN</w:t>
+            </w:r>
+          </w:p>
+        </w:tc>
+        <w:tc>
+          <w:tcPr>
+            <w:tcW w:type="dxa" w:w="6016"/>
+          </w:tcPr>
+          <w:p>
+            <w:r>
+              <w:t>CDN provider identification (Cloudflare, Akamai) implies WAF/auto-patching capability</w:t>
+            </w:r>
+          </w:p>
+        </w:tc>
+      </w:tr>
+      <w:tr>
+        <w:tc>
+          <w:tcPr>
+            <w:tcW w:type="dxa" w:w="3008"/>
+          </w:tcPr>
+          <w:p>
+            <w:r>
+              <w:t>Bug bounty programme</w:t>
+            </w:r>
+          </w:p>
+        </w:tc>
+        <w:tc>
+          <w:tcPr>
+            <w:tcW w:type="dxa" w:w="6016"/>
+          </w:tcPr>
+          <w:p>
+            <w:r>
+              <w:t>HackerOne / Bugcrowd programme page lookup</w:t>
+            </w:r>
+          </w:p>
+        </w:tc>
+      </w:tr>
+      <w:tr>
+        <w:tc>
+          <w:tcPr>
+            <w:tcW w:type="dxa" w:w="3008"/>
+          </w:tcPr>
+          <w:p>
+            <w:r>
+              <w:t>security.txt / VDP</w:t>
+            </w:r>
+          </w:p>
+        </w:tc>
+        <w:tc>
+          <w:tcPr>
+            <w:tcW w:type="dxa" w:w="6016"/>
+          </w:tcPr>
+          <w:p>
+            <w:r>
+              <w:t>/.well-known/security.txt presence and completeness (already checked by scanner)</w:t>
+            </w:r>
+          </w:p>
+        </w:tc>
+      </w:tr>
+      <w:tr>
+        <w:tc>
+          <w:tcPr>
+            <w:tcW w:type="dxa" w:w="3008"/>
+          </w:tcPr>
+          <w:p>
+            <w:r>
+              <w:t>Glasswing partnership</w:t>
+            </w:r>
+          </w:p>
+        </w:tc>
+        <w:tc>
+          <w:tcPr>
+            <w:tcW w:type="dxa" w:w="6016"/>
+          </w:tcPr>
+          <w:p>
+            <w:r>
+              <w:t>Public Anthropic partner list lookup (binary check)</w:t>
+            </w:r>
+          </w:p>
+        </w:tc>
+      </w:tr>
+    </w:tbl>
+    <w:p>
+      <w:pPr>
+        <w:spacing w:before="200" w:after="60"/>
+      </w:pPr>
+      <w:r>
+        <w:rPr>
+          <w:b/>
+        </w:rPr>
+        <w:t>CANNOT Detect Externally (Tier 2 — Self-Reported / Questionnaire)</w:t>
+      </w:r>
+    </w:p>
+    <w:tbl>
+      <w:tblPr>
+        <w:tblW w:type="auto" w:w="0"/>
+        <w:tblLook w:firstColumn="1" w:firstRow="1" w:lastColumn="0" w:lastRow="0" w:noHBand="0" w:noVBand="1" w:val="04A0"/>
+        <w:tblBorders>
+          <w:top w:val="single" w:sz="4" w:space="0" w:color="auto"/>
+          <w:left w:val="single" w:sz="4" w:space="0" w:color="auto"/>
+          <w:bottom w:val="single" w:sz="4" w:space="0" w:color="auto"/>
+          <w:right w:val="single" w:sz="4" w:space="0" w:color="auto"/>
+          <w:insideH w:val="single" w:sz="4" w:space="0" w:color="auto"/>
+          <w:insideV w:val="single" w:sz="4" w:space="0" w:color="auto"/>
+        </w:tblBorders>
+        <w:tblW w:w="5000" w:type="pct"/>
+      </w:tblPr>
+      <w:tblGrid>
+        <w:gridCol w:w="3008"/>
+        <w:gridCol w:w="6016"/>
+      </w:tblGrid>
+      <w:tr>
+        <w:tc>
+          <w:tcPr>
+            <w:tcW w:type="dxa" w:w="3008"/>
+            <w:shd w:fill="1B2A4A"/>
+          </w:tcPr>
+          <w:p>
+            <w:r>
+              <w:rPr>
+                <w:b/>
+                <w:color w:val="FFFFFF"/>
+              </w:rPr>
+              <w:t>Signal</w:t>
+            </w:r>
+          </w:p>
+        </w:tc>
+        <w:tc>
+          <w:tcPr>
+            <w:tcW w:type="dxa" w:w="6016"/>
+            <w:shd w:fill="1B2A4A"/>
+          </w:tcPr>
+          <w:p>
+            <w:r>
+              <w:rPr>
+                <w:b/>
+                <w:color w:val="FFFFFF"/>
+              </w:rPr>
+              <w:t>Reason / Limitation</w:t>
+            </w:r>
+          </w:p>
+        </w:tc>
+      </w:tr>
+      <w:tr>
+        <w:tc>
+          <w:tcPr>
+            <w:tcW w:type="dxa" w:w="3008"/>
+          </w:tcPr>
+          <w:p>
+            <w:r>
+              <w:t>Autonomous patching tools</w:t>
+            </w:r>
+          </w:p>
+        </w:tc>
+        <w:tc>
+          <w:tcPr>
+            <w:tcW w:type="dxa" w:w="6016"/>
+          </w:tcPr>
+          <w:p>
+            <w:r>
+              <w:t>Tanium, BigFix, WSUS — internal tools with no external fingerprint</w:t>
+            </w:r>
+          </w:p>
+        </w:tc>
+      </w:tr>
+      <w:tr>
+        <w:tc>
+          <w:tcPr>
+            <w:tcW w:type="dxa" w:w="3008"/>
+          </w:tcPr>
+          <w:p>
+            <w:r>
+              <w:t>AI-assisted internal vuln scanning</w:t>
+            </w:r>
+          </w:p>
+        </w:tc>
+        <w:tc>
+          <w:tcPr>
+            <w:tcW w:type="dxa" w:w="6016"/>
+          </w:tcPr>
+          <w:p>
+            <w:r>
+              <w:t>Internal scanning tools (Qualys, Tenable, Rapid7) not visible externally</w:t>
+            </w:r>
+          </w:p>
+        </w:tc>
+      </w:tr>
+      <w:tr>
+        <w:tc>
+          <w:tcPr>
+            <w:tcW w:type="dxa" w:w="3008"/>
+          </w:tcPr>
+          <w:p>
+            <w:r>
+              <w:t>MFA enforcement</w:t>
+            </w:r>
+          </w:p>
+        </w:tc>
+        <w:tc>
+          <w:tcPr>
+            <w:tcW w:type="dxa" w:w="6016"/>
+          </w:tcPr>
+          <w:p>
+            <w:r>
+              <w:t>Can only infer from login pages; cannot confirm MFA across all systems</w:t>
+            </w:r>
+          </w:p>
+        </w:tc>
+      </w:tr>
+      <w:tr>
+        <w:tc>
+          <w:tcPr>
+            <w:tcW w:type="dxa" w:w="3008"/>
+          </w:tcPr>
+          <w:p>
+            <w:r>
+              <w:t>Incident response readiness</w:t>
+            </w:r>
+          </w:p>
+        </w:tc>
+        <w:tc>
+          <w:tcPr>
+            <w:tcW w:type="dxa" w:w="6016"/>
+          </w:tcPr>
+          <w:p>
+            <w:r>
+              <w:t>IR plans, tabletop exercises, retainer agreements — entirely internal</w:t>
+            </w:r>
+          </w:p>
+        </w:tc>
+      </w:tr>
+      <w:tr>
+        <w:tc>
+          <w:tcPr>
+            <w:tcW w:type="dxa" w:w="3008"/>
+          </w:tcPr>
+          <w:p>
+            <w:r>
+              <w:t>Staff security training</w:t>
+            </w:r>
+          </w:p>
+        </w:tc>
+        <w:tc>
+          <w:tcPr>
+            <w:tcW w:type="dxa" w:w="6016"/>
+          </w:tcPr>
+          <w:p>
+            <w:r>
+              <w:t>Phishing awareness, security culture programmes — no external indicator</w:t>
             </w:r>
           </w:p>
         </w:tc>

</xml_diff>